<commit_message>
ajuste documento de extensão com empresa
</commit_message>
<xml_diff>
--- a/Documentos/Documento - Projeto de Extensão - COM Empresa - 2026_1.docx
+++ b/Documentos/Documento - Projeto de Extensão - COM Empresa - 2026_1.docx
@@ -381,8 +381,6 @@
               </w:rPr>
               <w:t>Zimmer</w:t>
             </w:r>
-            <w:bookmarkStart w:id="0" w:name="_GoBack"/>
-            <w:bookmarkEnd w:id="0"/>
             <w:proofErr w:type="spellEnd"/>
           </w:p>
         </w:tc>
@@ -493,8 +491,13 @@
               </w:rPr>
             </w:pPr>
             <w:r>
-              <w:t>23025479</w:t>
-            </w:r>
+              <w:t>2302547</w:t>
+            </w:r>
+            <w:r>
+              <w:t>6</w:t>
+            </w:r>
+            <w:bookmarkStart w:id="0" w:name="_GoBack"/>
+            <w:bookmarkEnd w:id="0"/>
           </w:p>
         </w:tc>
       </w:tr>
@@ -7549,6 +7552,17 @@
 </file>
 
 <file path=customXml/item1.xml><?xml version="1.0" encoding="utf-8"?>
+<p:properties xmlns:p="http://schemas.microsoft.com/office/2006/metadata/properties" xmlns:xsi="http://www.w3.org/2001/XMLSchema-instance" xmlns:pc="http://schemas.microsoft.com/office/infopath/2007/PartnerControls">
+  <documentManagement>
+    <lcf76f155ced4ddcb4097134ff3c332f xmlns="8ca2a57e-8138-4b57-956a-eb6e2c7049cc">
+      <Terms xmlns="http://schemas.microsoft.com/office/infopath/2007/PartnerControls"/>
+    </lcf76f155ced4ddcb4097134ff3c332f>
+    <TaxCatchAll xmlns="1d2798d9-1030-4cc5-be7b-200f9e628651" xsi:nil="true"/>
+  </documentManagement>
+</p:properties>
+</file>
+
+<file path=customXml/item2.xml><?xml version="1.0" encoding="utf-8"?>
 <ct:contentTypeSchema xmlns:ct="http://schemas.microsoft.com/office/2006/metadata/contentType" xmlns:ma="http://schemas.microsoft.com/office/2006/metadata/properties/metaAttributes" ct:_="" ma:_="" ma:contentTypeName="Documento" ma:contentTypeID="0x01010045364877AF745B4281652B53F43C594A" ma:contentTypeVersion="15" ma:contentTypeDescription="Crie um novo documento." ma:contentTypeScope="" ma:versionID="d0aca78f0edc9854d9577b32f48b226a">
   <xsd:schema xmlns:xsd="http://www.w3.org/2001/XMLSchema" xmlns:xs="http://www.w3.org/2001/XMLSchema" xmlns:p="http://schemas.microsoft.com/office/2006/metadata/properties" xmlns:ns2="1d2798d9-1030-4cc5-be7b-200f9e628651" xmlns:ns3="8ca2a57e-8138-4b57-956a-eb6e2c7049cc" targetNamespace="http://schemas.microsoft.com/office/2006/metadata/properties" ma:root="true" ma:fieldsID="4612fc6d25e147ba50590cbb4310a89d" ns2:_="" ns3:_="">
     <xsd:import namespace="1d2798d9-1030-4cc5-be7b-200f9e628651"/>
@@ -7783,17 +7797,6 @@
 </ct:contentTypeSchema>
 </file>
 
-<file path=customXml/item2.xml><?xml version="1.0" encoding="utf-8"?>
-<p:properties xmlns:p="http://schemas.microsoft.com/office/2006/metadata/properties" xmlns:xsi="http://www.w3.org/2001/XMLSchema-instance" xmlns:pc="http://schemas.microsoft.com/office/infopath/2007/PartnerControls">
-  <documentManagement>
-    <lcf76f155ced4ddcb4097134ff3c332f xmlns="8ca2a57e-8138-4b57-956a-eb6e2c7049cc">
-      <Terms xmlns="http://schemas.microsoft.com/office/infopath/2007/PartnerControls"/>
-    </lcf76f155ced4ddcb4097134ff3c332f>
-    <TaxCatchAll xmlns="1d2798d9-1030-4cc5-be7b-200f9e628651" xsi:nil="true"/>
-  </documentManagement>
-</p:properties>
-</file>
-
 <file path=customXml/item3.xml><?xml version="1.0" encoding="utf-8"?>
 <?mso-contentType ?>
 <FormTemplates xmlns="http://schemas.microsoft.com/sharepoint/v3/contenttype/forms">
@@ -7804,6 +7807,17 @@
 </file>
 
 <file path=customXml/itemProps1.xml><?xml version="1.0" encoding="utf-8"?>
+<ds:datastoreItem xmlns:ds="http://schemas.openxmlformats.org/officeDocument/2006/customXml" ds:itemID="{F4C3DEEC-2600-444B-9739-BAA4A738EA1E}">
+  <ds:schemaRefs>
+    <ds:schemaRef ds:uri="http://schemas.microsoft.com/office/2006/metadata/properties"/>
+    <ds:schemaRef ds:uri="http://schemas.microsoft.com/office/infopath/2007/PartnerControls"/>
+    <ds:schemaRef ds:uri="8ca2a57e-8138-4b57-956a-eb6e2c7049cc"/>
+    <ds:schemaRef ds:uri="1d2798d9-1030-4cc5-be7b-200f9e628651"/>
+  </ds:schemaRefs>
+</ds:datastoreItem>
+</file>
+
+<file path=customXml/itemProps2.xml><?xml version="1.0" encoding="utf-8"?>
 <ds:datastoreItem xmlns:ds="http://schemas.openxmlformats.org/officeDocument/2006/customXml" ds:itemID="{05CF8F48-FB5F-4E20-B2D4-E9A2A1F67ED6}">
   <ds:schemaRefs>
     <ds:schemaRef ds:uri="http://schemas.microsoft.com/office/2006/metadata/contentType"/>
@@ -7822,17 +7836,6 @@
 </ds:datastoreItem>
 </file>
 
-<file path=customXml/itemProps2.xml><?xml version="1.0" encoding="utf-8"?>
-<ds:datastoreItem xmlns:ds="http://schemas.openxmlformats.org/officeDocument/2006/customXml" ds:itemID="{F4C3DEEC-2600-444B-9739-BAA4A738EA1E}">
-  <ds:schemaRefs>
-    <ds:schemaRef ds:uri="http://schemas.microsoft.com/office/2006/metadata/properties"/>
-    <ds:schemaRef ds:uri="http://schemas.microsoft.com/office/infopath/2007/PartnerControls"/>
-    <ds:schemaRef ds:uri="8ca2a57e-8138-4b57-956a-eb6e2c7049cc"/>
-    <ds:schemaRef ds:uri="1d2798d9-1030-4cc5-be7b-200f9e628651"/>
-  </ds:schemaRefs>
-</ds:datastoreItem>
-</file>
-
 <file path=customXml/itemProps3.xml><?xml version="1.0" encoding="utf-8"?>
 <ds:datastoreItem xmlns:ds="http://schemas.openxmlformats.org/officeDocument/2006/customXml" ds:itemID="{48DFB5F4-52F4-4628-91A3-77FC7DBF31CA}">
   <ds:schemaRefs>

</xml_diff>